<commit_message>
Polish certificate and exam report print layout
</commit_message>
<xml_diff>
--- a/static/templates/certificate.docx
+++ b/static/templates/certificate.docx
@@ -6,7 +6,7 @@
       <w:pPr>
         <w:pStyle w:val="Normal"/>
         <w:spacing w:lineRule="auto" w:line="240" w:before="0" w:after="0"/>
-        <w:jc w:val="both"/>
+        <w:jc w:val="left"/>
         <w:rPr>
           <w:rFonts w:ascii="Arial" w:hAnsi="Arial" w:eastAsia="NSimSun" w:cs="Arial"/>
           <w:kern w:val="2"/>
@@ -443,7 +443,9 @@
     <w:p>
       <w:pPr>
         <w:pStyle w:val="Normal"/>
-        <w:spacing w:lineRule="auto" w:line="240" w:before="0" w:after="0"/>
+        <w:spacing w:lineRule="auto" w:line="240" w:before="0" w:after="360"/>
+        <w:ind w:right="360"/>
+        <w:jc w:val="right"/>
         <w:rPr>
           <w:rFonts w:ascii="Arial" w:hAnsi="Arial" w:cs="Arial"/>
           <w:sz w:val="24"/>
@@ -519,7 +521,9 @@
     <w:p>
       <w:pPr>
         <w:pStyle w:val="Normal"/>
-        <w:spacing w:lineRule="auto" w:line="240" w:before="0" w:after="0"/>
+        <w:spacing w:lineRule="auto" w:line="240" w:before="240" w:after="0"/>
+        <w:ind w:right="720"/>
+        <w:jc w:val="right"/>
         <w:rPr>
           <w:rFonts w:ascii="Arial" w:hAnsi="Arial" w:cs="Arial"/>
           <w:sz w:val="24"/>
@@ -529,10 +533,11 @@
       <w:r>
         <w:rPr>
           <w:rFonts w:eastAsia="Arial" w:cs="Arial" w:ascii="Arial" w:hAnsi="Arial"/>
-          <w:sz w:val="24"/>
-          <w:szCs w:val="24"/>
-        </w:rPr>
-        <w:t>Δκτής ΚΑΙ</w:t>
+          <w:b w:val="0"/>
+          <w:sz w:val="24"/>
+          <w:szCs w:val="24"/>
+        </w:rPr>
+        <w:t>ΔΚΤΗΣ ΚΑΙ</w:t>
       </w:r>
     </w:p>
     <w:p>

</xml_diff>